<commit_message>
Version 4.7 - Integration API CloudFare - Wrangler
</commit_message>
<xml_diff>
--- a/LeGrandGeoQuiz.docx
+++ b/LeGrandGeoQuiz.docx
@@ -785,23 +785,25 @@
           <w:rFonts w:ascii="72" w:hAnsi="72" w:cs="72"/>
           <w:lang w:val="fr-FR"/>
         </w:rPr>
-        <w:t xml:space="preserve"> ne doit pas être visible a </w:t>
-      </w:r>
-      <w:proofErr w:type="spellStart"/>
-      <w:r>
-        <w:rPr>
-          <w:rFonts w:ascii="72" w:hAnsi="72" w:cs="72"/>
-          <w:lang w:val="fr-FR"/>
-        </w:rPr>
-        <w:t>la</w:t>
-      </w:r>
-      <w:proofErr w:type="spellEnd"/>
-      <w:r>
-        <w:rPr>
-          <w:rFonts w:ascii="72" w:hAnsi="72" w:cs="72"/>
-          <w:lang w:val="fr-FR"/>
-        </w:rPr>
-        <w:t xml:space="preserve"> fin de la partie pour éviter la triche.</w:t>
+        <w:t xml:space="preserve"> ne doit pas être visible </w:t>
+      </w:r>
+      <w:proofErr w:type="spellStart"/>
+      <w:proofErr w:type="gramStart"/>
+      <w:r>
+        <w:rPr>
+          <w:rFonts w:ascii="72" w:hAnsi="72" w:cs="72"/>
+          <w:lang w:val="fr-FR"/>
+        </w:rPr>
+        <w:t>a</w:t>
+      </w:r>
+      <w:proofErr w:type="spellEnd"/>
+      <w:proofErr w:type="gramEnd"/>
+      <w:r>
+        <w:rPr>
+          <w:rFonts w:ascii="72" w:hAnsi="72" w:cs="72"/>
+          <w:lang w:val="fr-FR"/>
+        </w:rPr>
+        <w:t xml:space="preserve"> la fin de la partie pour éviter la triche.</w:t>
       </w:r>
     </w:p>
     <w:p>
@@ -1110,7 +1112,7 @@
           <w:rFonts w:ascii="72" w:hAnsi="72" w:cs="72"/>
           <w:b/>
           <w:bCs/>
-          <w:highlight w:val="yellow"/>
+          <w:highlight w:val="green"/>
           <w:lang w:val="fr-FR"/>
         </w:rPr>
         <w:t>Possibilité de jouer en mode Normal, Hardcore ou Reverse</w:t>
@@ -1190,7 +1192,7 @@
           <w:rFonts w:ascii="72" w:hAnsi="72" w:cs="72"/>
           <w:b/>
           <w:bCs/>
-          <w:highlight w:val="yellow"/>
+          <w:highlight w:val="green"/>
           <w:lang w:val="fr-FR"/>
         </w:rPr>
         <w:t xml:space="preserve">Sélection des </w:t>
@@ -1200,7 +1202,7 @@
           <w:rFonts w:ascii="72" w:hAnsi="72" w:cs="72"/>
           <w:b/>
           <w:bCs/>
-          <w:highlight w:val="yellow"/>
+          <w:highlight w:val="green"/>
           <w:lang w:val="fr-FR"/>
         </w:rPr>
         <w:t>Pays</w:t>
@@ -1470,9 +1472,10 @@
           <w:lang w:val="fr-FR"/>
         </w:rPr>
         <w:br/>
-        <w:t xml:space="preserve">les pays a exclure ou </w:t>
-      </w:r>
-      <w:proofErr w:type="spellStart"/>
+        <w:t xml:space="preserve">les pays </w:t>
+      </w:r>
+      <w:proofErr w:type="spellStart"/>
+      <w:proofErr w:type="gramStart"/>
       <w:r>
         <w:rPr>
           <w:rFonts w:ascii="72" w:hAnsi="72" w:cs="72"/>
@@ -1481,6 +1484,25 @@
         <w:t>a</w:t>
       </w:r>
       <w:proofErr w:type="spellEnd"/>
+      <w:proofErr w:type="gramEnd"/>
+      <w:r>
+        <w:rPr>
+          <w:rFonts w:ascii="72" w:hAnsi="72" w:cs="72"/>
+          <w:lang w:val="fr-FR"/>
+        </w:rPr>
+        <w:t xml:space="preserve"> exclure ou </w:t>
+      </w:r>
+      <w:proofErr w:type="spellStart"/>
+      <w:proofErr w:type="gramStart"/>
+      <w:r>
+        <w:rPr>
+          <w:rFonts w:ascii="72" w:hAnsi="72" w:cs="72"/>
+          <w:lang w:val="fr-FR"/>
+        </w:rPr>
+        <w:t>a</w:t>
+      </w:r>
+      <w:proofErr w:type="spellEnd"/>
+      <w:proofErr w:type="gramEnd"/>
       <w:r>
         <w:rPr>
           <w:rFonts w:ascii="72" w:hAnsi="72" w:cs="72"/>
@@ -1489,6 +1511,7 @@
         <w:t xml:space="preserve"> intégrer absolument </w:t>
       </w:r>
       <w:proofErr w:type="spellStart"/>
+      <w:proofErr w:type="gramStart"/>
       <w:r>
         <w:rPr>
           <w:rFonts w:ascii="72" w:hAnsi="72" w:cs="72"/>
@@ -1497,6 +1520,7 @@
         <w:t>a</w:t>
       </w:r>
       <w:proofErr w:type="spellEnd"/>
+      <w:proofErr w:type="gramEnd"/>
       <w:r>
         <w:rPr>
           <w:rFonts w:ascii="72" w:hAnsi="72" w:cs="72"/>
@@ -1667,15 +1691,13 @@
         <w:br/>
         <w:t xml:space="preserve">Il existera aussi des </w:t>
       </w:r>
-      <w:proofErr w:type="spellStart"/>
-      <w:r>
-        <w:rPr>
-          <w:rFonts w:ascii="72" w:hAnsi="72" w:cs="72"/>
-          <w:lang w:val="fr-FR"/>
-        </w:rPr>
-        <w:t>templates</w:t>
-      </w:r>
-      <w:proofErr w:type="spellEnd"/>
+      <w:r>
+        <w:rPr>
+          <w:rFonts w:ascii="72" w:hAnsi="72" w:cs="72"/>
+          <w:lang w:val="fr-FR"/>
+        </w:rPr>
+        <w:t>Template</w:t>
+      </w:r>
       <w:r>
         <w:rPr>
           <w:rFonts w:ascii="72" w:hAnsi="72" w:cs="72"/>
@@ -1714,15 +1736,13 @@
         </w:rPr>
         <w:t xml:space="preserve">Des modes plus </w:t>
       </w:r>
-      <w:proofErr w:type="gramStart"/>
-      <w:r>
-        <w:rPr>
-          <w:rFonts w:ascii="72" w:hAnsi="72" w:cs="72"/>
-          <w:lang w:val="fr-FR"/>
-        </w:rPr>
-        <w:t>funs:</w:t>
-      </w:r>
-      <w:proofErr w:type="gramEnd"/>
+      <w:r>
+        <w:rPr>
+          <w:rFonts w:ascii="72" w:hAnsi="72" w:cs="72"/>
+          <w:lang w:val="fr-FR"/>
+        </w:rPr>
+        <w:t>funs :</w:t>
+      </w:r>
       <w:r>
         <w:rPr>
           <w:rFonts w:ascii="72" w:hAnsi="72" w:cs="72"/>
@@ -1783,20 +1803,69 @@
           <w:lang w:val="fr-FR"/>
         </w:rPr>
       </w:pPr>
-    </w:p>
-    <w:p>
-      <w:pPr>
-        <w:rPr>
-          <w:rFonts w:ascii="72" w:hAnsi="72" w:cs="72"/>
-          <w:b/>
-          <w:bCs/>
-        </w:rPr>
-      </w:pPr>
-      <w:r>
-        <w:rPr>
-          <w:rFonts w:ascii="72" w:hAnsi="72" w:cs="72"/>
-          <w:b/>
-          <w:bCs/>
+      <w:r>
+        <w:rPr>
+          <w:rFonts w:ascii="72" w:hAnsi="72" w:cs="72"/>
+          <w:b/>
+          <w:bCs/>
+          <w:highlight w:val="green"/>
+          <w:lang w:val="fr-FR"/>
+        </w:rPr>
+        <w:t xml:space="preserve">Sélection des </w:t>
+      </w:r>
+      <w:r>
+        <w:rPr>
+          <w:rFonts w:ascii="72" w:hAnsi="72" w:cs="72"/>
+          <w:b/>
+          <w:bCs/>
+          <w:highlight w:val="green"/>
+          <w:lang w:val="fr-FR"/>
+        </w:rPr>
+        <w:t>Catégorie</w:t>
+      </w:r>
+      <w:r>
+        <w:rPr>
+          <w:rFonts w:ascii="72" w:hAnsi="72" w:cs="72"/>
+          <w:b/>
+          <w:bCs/>
+          <w:lang w:val="fr-FR"/>
+        </w:rPr>
+        <w:t> : Baser sur l</w:t>
+      </w:r>
+      <w:r>
+        <w:rPr>
+          <w:rFonts w:ascii="72" w:hAnsi="72" w:cs="72"/>
+          <w:b/>
+          <w:bCs/>
+          <w:lang w:val="fr-FR"/>
+        </w:rPr>
+        <w:t>e même moteur de la sélection des pays.</w:t>
+      </w:r>
+    </w:p>
+    <w:p>
+      <w:pPr>
+        <w:ind w:left="720"/>
+        <w:rPr>
+          <w:rFonts w:ascii="72" w:hAnsi="72" w:cs="72"/>
+          <w:lang w:val="fr-FR"/>
+        </w:rPr>
+      </w:pPr>
+    </w:p>
+    <w:p>
+      <w:pPr>
+        <w:rPr>
+          <w:rFonts w:ascii="72" w:hAnsi="72" w:cs="72"/>
+          <w:b/>
+          <w:bCs/>
+          <w:lang w:val="fr-FR"/>
+        </w:rPr>
+      </w:pPr>
+      <w:r>
+        <w:rPr>
+          <w:rFonts w:ascii="72" w:hAnsi="72" w:cs="72"/>
+          <w:b/>
+          <w:bCs/>
+          <w:lang w:val="fr-FR"/>
         </w:rPr>
         <w:t>5. Description Technique</w:t>
       </w:r>
@@ -2022,6 +2091,7 @@
           <w:bCs/>
           <w:lang w:val="fr-FR"/>
         </w:rPr>
+        <w:lastRenderedPageBreak/>
         <w:t>Données :</w:t>
       </w:r>
       <w:r>
@@ -2056,76 +2126,45 @@
           <w:rFonts w:ascii="72" w:hAnsi="72" w:cs="72"/>
           <w:b/>
           <w:bCs/>
-        </w:rPr>
-      </w:pPr>
-      <w:r>
-        <w:rPr>
-          <w:rFonts w:ascii="72" w:hAnsi="72" w:cs="72"/>
-          <w:b/>
-          <w:bCs/>
-        </w:rPr>
-        <w:lastRenderedPageBreak/>
-        <w:t>6. Musique</w:t>
-      </w:r>
-      <w:r>
-        <w:rPr>
-          <w:rFonts w:ascii="72" w:hAnsi="72" w:cs="72"/>
-          <w:b/>
-          <w:bCs/>
-        </w:rPr>
-        <w:t xml:space="preserve"> &amp; </w:t>
-      </w:r>
-      <w:proofErr w:type="spellStart"/>
-      <w:r>
-        <w:rPr>
-          <w:rFonts w:ascii="72" w:hAnsi="72" w:cs="72"/>
-          <w:b/>
-          <w:bCs/>
-        </w:rPr>
-        <w:t>Effets</w:t>
-      </w:r>
-      <w:proofErr w:type="spellEnd"/>
-      <w:r>
-        <w:rPr>
-          <w:rFonts w:ascii="72" w:hAnsi="72" w:cs="72"/>
-          <w:b/>
-          <w:bCs/>
-        </w:rPr>
-        <w:t xml:space="preserve"> </w:t>
-      </w:r>
-      <w:proofErr w:type="spellStart"/>
-      <w:r>
-        <w:rPr>
-          <w:rFonts w:ascii="72" w:hAnsi="72" w:cs="72"/>
-          <w:b/>
-          <w:bCs/>
-        </w:rPr>
-        <w:t>sonores</w:t>
-      </w:r>
-      <w:proofErr w:type="spellEnd"/>
-      <w:r>
-        <w:rPr>
-          <w:rFonts w:ascii="72" w:hAnsi="72" w:cs="72"/>
-          <w:b/>
-          <w:bCs/>
-        </w:rPr>
-        <w:t>:</w:t>
-      </w:r>
-    </w:p>
-    <w:p>
-      <w:pPr>
-        <w:rPr>
-          <w:rFonts w:ascii="72" w:hAnsi="72" w:cs="72"/>
-          <w:b/>
-          <w:bCs/>
-          <w:lang w:val="fr-FR"/>
-        </w:rPr>
-      </w:pPr>
-      <w:r>
-        <w:rPr>
-          <w:rFonts w:ascii="72" w:hAnsi="72" w:cs="72"/>
-          <w:b/>
-          <w:bCs/>
+          <w:lang w:val="fr-FR"/>
+        </w:rPr>
+      </w:pPr>
+      <w:r>
+        <w:rPr>
+          <w:rFonts w:ascii="72" w:hAnsi="72" w:cs="72"/>
+          <w:b/>
+          <w:bCs/>
+          <w:lang w:val="fr-FR"/>
+        </w:rPr>
+        <w:t xml:space="preserve">6. Musique &amp; Effets </w:t>
+      </w:r>
+      <w:proofErr w:type="gramStart"/>
+      <w:r>
+        <w:rPr>
+          <w:rFonts w:ascii="72" w:hAnsi="72" w:cs="72"/>
+          <w:b/>
+          <w:bCs/>
+          <w:lang w:val="fr-FR"/>
+        </w:rPr>
+        <w:t>sonores:</w:t>
+      </w:r>
+      <w:proofErr w:type="gramEnd"/>
+    </w:p>
+    <w:p>
+      <w:pPr>
+        <w:rPr>
+          <w:rFonts w:ascii="72" w:hAnsi="72" w:cs="72"/>
+          <w:b/>
+          <w:bCs/>
+          <w:lang w:val="fr-FR"/>
+        </w:rPr>
+      </w:pPr>
+      <w:r>
+        <w:rPr>
+          <w:rFonts w:ascii="72" w:hAnsi="72" w:cs="72"/>
+          <w:b/>
+          <w:bCs/>
+          <w:lang w:val="fr-FR"/>
         </w:rPr>
         <w:tab/>
       </w:r>
@@ -2572,7 +2611,27 @@
           <w:lang w:val="fr-FR"/>
         </w:rPr>
         <w:br/>
-        <w:t>Bruit de gong a la fin de la partie</w:t>
+        <w:t xml:space="preserve">Bruit de gong </w:t>
+      </w:r>
+      <w:proofErr w:type="spellStart"/>
+      <w:r>
+        <w:rPr>
+          <w:rFonts w:ascii="72" w:hAnsi="72" w:cs="72"/>
+          <w:sz w:val="20"/>
+          <w:szCs w:val="20"/>
+          <w:lang w:val="fr-FR"/>
+        </w:rPr>
+        <w:t>a</w:t>
+      </w:r>
+      <w:proofErr w:type="spellEnd"/>
+      <w:r>
+        <w:rPr>
+          <w:rFonts w:ascii="72" w:hAnsi="72" w:cs="72"/>
+          <w:sz w:val="20"/>
+          <w:szCs w:val="20"/>
+          <w:lang w:val="fr-FR"/>
+        </w:rPr>
+        <w:t xml:space="preserve"> la fin de la partie</w:t>
       </w:r>
       <w:r>
         <w:rPr>
@@ -2582,7 +2641,27 @@
           <w:lang w:val="fr-FR"/>
         </w:rPr>
         <w:br/>
-        <w:t>Bruit de petite aiguille (a la chess.com quand il reste plus beaucoup de temps)</w:t>
+        <w:t>Bruit de petite aiguille (</w:t>
+      </w:r>
+      <w:proofErr w:type="spellStart"/>
+      <w:r>
+        <w:rPr>
+          <w:rFonts w:ascii="72" w:hAnsi="72" w:cs="72"/>
+          <w:sz w:val="20"/>
+          <w:szCs w:val="20"/>
+          <w:lang w:val="fr-FR"/>
+        </w:rPr>
+        <w:t>a</w:t>
+      </w:r>
+      <w:proofErr w:type="spellEnd"/>
+      <w:r>
+        <w:rPr>
+          <w:rFonts w:ascii="72" w:hAnsi="72" w:cs="72"/>
+          <w:sz w:val="20"/>
+          <w:szCs w:val="20"/>
+          <w:lang w:val="fr-FR"/>
+        </w:rPr>
+        <w:t xml:space="preserve"> la chess.com quand il reste plus beaucoup de temps)</w:t>
       </w:r>
       <w:r>
         <w:rPr>
@@ -2612,7 +2691,27 @@
           <w:szCs w:val="20"/>
           <w:lang w:val="fr-FR"/>
         </w:rPr>
-        <w:t xml:space="preserve"> du score a chaque cran</w:t>
+        <w:t xml:space="preserve"> du score </w:t>
+      </w:r>
+      <w:proofErr w:type="spellStart"/>
+      <w:r>
+        <w:rPr>
+          <w:rFonts w:ascii="72" w:hAnsi="72" w:cs="72"/>
+          <w:sz w:val="20"/>
+          <w:szCs w:val="20"/>
+          <w:lang w:val="fr-FR"/>
+        </w:rPr>
+        <w:t>a</w:t>
+      </w:r>
+      <w:proofErr w:type="spellEnd"/>
+      <w:r>
+        <w:rPr>
+          <w:rFonts w:ascii="72" w:hAnsi="72" w:cs="72"/>
+          <w:sz w:val="20"/>
+          <w:szCs w:val="20"/>
+          <w:lang w:val="fr-FR"/>
+        </w:rPr>
+        <w:t xml:space="preserve"> chaque cran</w:t>
       </w:r>
       <w:r>
         <w:rPr>
@@ -4309,6 +4408,7 @@
   <w:style w:type="character" w:default="1" w:styleId="DefaultParagraphFont">
     <w:name w:val="Default Paragraph Font"/>
     <w:uiPriority w:val="1"/>
+    <w:semiHidden/>
     <w:unhideWhenUsed/>
   </w:style>
   <w:style w:type="table" w:default="1" w:styleId="TableNormal">

</xml_diff>